<commit_message>
Update documentation for the events page, venue field and auto take-down (16 tests, 4 figures)
</commit_message>
<xml_diff>
--- a/docs/CSE101_Final_Project_Documentation_CHCC_Student_Announcements.docx
+++ b/docs/CSE101_Final_Project_Documentation_CHCC_Student_Announcements.docx
@@ -175,6 +175,19 @@
           <w:rFonts w:ascii="Calibri" w:hAnsi="Calibri"/>
           <w:sz w:val="22"/>
         </w:rPr>
+        <w:t xml:space="preserve">A second tab - the Events page - lists every dated note soonest-first with a calendar chip, its venue and a countdown, and switches between Upcoming and Past. Notices can also carry their own place (Main Gymnasium, Room 204...) and their own take-it-down time, so a stale notice clears itself off the board and out of storage.</w:t>
+      </w:r>
+    </w:p>
+    <w:p>
+      <w:pPr>
+        <w:spacing w:before="0" w:after="160"/>
+        <w:jc w:val="both"/>
+      </w:pPr>
+      <w:r>
+        <w:rPr>
+          <w:rFonts w:ascii="Calibri" w:hAnsi="Calibri"/>
+          <w:sz w:val="22"/>
+        </w:rPr>
         <w:t xml:space="preserve">The system was developed with Flutter, a single codebase that runs on Android, the web and the desktop. The Android build is released as an installable APK, while the web build can be shared as a plain link - no installation required.</w:t>
       </w:r>
     </w:p>
@@ -331,7 +344,35 @@
           <w:rFonts w:ascii="Calibri" w:hAnsi="Calibri"/>
           <w:sz w:val="22"/>
         </w:rPr>
-        <w:t xml:space="preserve">7. Deliver the system as an installable Android APK and as a web application.</w:t>
+        <w:t xml:space="preserve">7. Show all dated notices on an Events page ordered soonest-first, with venue, countdown and an Upcoming / Past switch.</w:t>
+      </w:r>
+    </w:p>
+    <w:p>
+      <w:pPr>
+        <w:spacing w:before="0" w:after="80"/>
+        <w:ind w:left="360" w:hanging="360"/>
+        <w:jc w:val="left"/>
+      </w:pPr>
+      <w:r>
+        <w:rPr>
+          <w:rFonts w:ascii="Calibri" w:hAnsi="Calibri"/>
+          <w:sz w:val="22"/>
+        </w:rPr>
+        <w:t xml:space="preserve">8. Let a notice carry its own venue and its own take-it-down time so stale notes clear themselves.</w:t>
+      </w:r>
+    </w:p>
+    <w:p>
+      <w:pPr>
+        <w:spacing w:before="0" w:after="80"/>
+        <w:ind w:left="360" w:hanging="360"/>
+        <w:jc w:val="left"/>
+      </w:pPr>
+      <w:r>
+        <w:rPr>
+          <w:rFonts w:ascii="Calibri" w:hAnsi="Calibri"/>
+          <w:sz w:val="22"/>
+        </w:rPr>
+        <w:t xml:space="preserve">9. Deliver the system as an installable Android APK and as a web application.</w:t>
       </w:r>
     </w:p>
     <w:p>
@@ -517,6 +558,126 @@
                 <w:rFonts w:ascii="Calibri" w:hAnsi="Calibri"/>
                 <w:sz w:val="20"/>
               </w:rPr>
+              <w:t xml:space="preserve">Events page</w:t>
+            </w:r>
+          </w:p>
+        </w:tc>
+        <w:tc>
+          <w:tcPr>
+            <w:tcW w:w="4680" w:type="dxa"/>
+            <w:vAlign w:val="top"/>
+          </w:tcPr>
+          <w:p>
+            <w:pPr>
+              <w:spacing w:before="40" w:after="40"/>
+              <w:jc w:val="left"/>
+            </w:pPr>
+            <w:r>
+              <w:rPr>
+                <w:rFonts w:ascii="Calibri" w:hAnsi="Calibri"/>
+                <w:sz w:val="20"/>
+              </w:rPr>
+              <w:t xml:space="preserve">The second tab of the bottom navigation: every dated note soonest-first with a calendar chip, venue, date strip and countdown, an Upcoming / Past switch, and UPCOMING, 7 DAYS, TEMPORARY and PAST counters.</w:t>
+            </w:r>
+          </w:p>
+        </w:tc>
+      </w:tr>
+      <w:tr>
+        <w:tc>
+          <w:tcPr>
+            <w:tcW w:w="4680" w:type="dxa"/>
+            <w:vAlign w:val="top"/>
+          </w:tcPr>
+          <w:p>
+            <w:pPr>
+              <w:spacing w:before="40" w:after="40"/>
+              <w:jc w:val="left"/>
+            </w:pPr>
+            <w:r>
+              <w:rPr>
+                <w:rFonts w:ascii="Calibri" w:hAnsi="Calibri"/>
+                <w:sz w:val="20"/>
+              </w:rPr>
+              <w:t xml:space="preserve">Venue on every note</w:t>
+            </w:r>
+          </w:p>
+        </w:tc>
+        <w:tc>
+          <w:tcPr>
+            <w:tcW w:w="4680" w:type="dxa"/>
+            <w:vAlign w:val="top"/>
+          </w:tcPr>
+          <w:p>
+            <w:pPr>
+              <w:spacing w:before="40" w:after="40"/>
+              <w:jc w:val="left"/>
+            </w:pPr>
+            <w:r>
+              <w:rPr>
+                <w:rFonts w:ascii="Calibri" w:hAnsi="Calibri"/>
+                <w:sz w:val="20"/>
+              </w:rPr>
+              <w:t xml:space="preserve">Each notice can carry its own place (CHCC Gymnasium, Room 204...) shown on the board card, the detail sheet, the compose form and the events page.</w:t>
+            </w:r>
+          </w:p>
+        </w:tc>
+      </w:tr>
+      <w:tr>
+        <w:tc>
+          <w:tcPr>
+            <w:tcW w:w="4680" w:type="dxa"/>
+            <w:vAlign w:val="top"/>
+          </w:tcPr>
+          <w:p>
+            <w:pPr>
+              <w:spacing w:before="40" w:after="40"/>
+              <w:jc w:val="left"/>
+            </w:pPr>
+            <w:r>
+              <w:rPr>
+                <w:rFonts w:ascii="Calibri" w:hAnsi="Calibri"/>
+                <w:sz w:val="20"/>
+              </w:rPr>
+              <w:t xml:space="preserve">Auto take-down</w:t>
+            </w:r>
+          </w:p>
+        </w:tc>
+        <w:tc>
+          <w:tcPr>
+            <w:tcW w:w="4680" w:type="dxa"/>
+            <w:vAlign w:val="top"/>
+          </w:tcPr>
+          <w:p>
+            <w:pPr>
+              <w:spacing w:before="40" w:after="40"/>
+              <w:jc w:val="left"/>
+            </w:pPr>
+            <w:r>
+              <w:rPr>
+                <w:rFonts w:ascii="Calibri" w:hAnsi="Calibri"/>
+                <w:sz w:val="20"/>
+              </w:rPr>
+              <w:t xml:space="preserve">A take-it-down timer (after the event / 24 hours / 3 / 7 / 30 days) with a live preview; temporary notes wear a TAKES ITSELF DOWN pill and are dropped from the board, the events page and storage once their time passes.</w:t>
+            </w:r>
+          </w:p>
+        </w:tc>
+      </w:tr>
+      <w:tr>
+        <w:tc>
+          <w:tcPr>
+            <w:tcW w:w="4680" w:type="dxa"/>
+            <w:vAlign w:val="top"/>
+          </w:tcPr>
+          <w:p>
+            <w:pPr>
+              <w:spacing w:before="40" w:after="40"/>
+              <w:jc w:val="left"/>
+            </w:pPr>
+            <w:r>
+              <w:rPr>
+                <w:rFonts w:ascii="Calibri" w:hAnsi="Calibri"/>
+                <w:sz w:val="20"/>
+              </w:rPr>
               <w:t xml:space="preserve">Keyword search</w:t>
             </w:r>
           </w:p>
@@ -736,7 +897,7 @@
                 <w:rFonts w:ascii="Calibri" w:hAnsi="Calibri"/>
                 <w:sz w:val="20"/>
               </w:rPr>
-              <w:t xml:space="preserve">Form with title, category, description, poster, date and time pickers, validation and an urgent switch.</w:t>
+              <w:t xml:space="preserve">Form with title, category, description, poster, date and time pickers, venue, a take-it-down timer with live preview, validation and an urgent switch.</w:t>
             </w:r>
           </w:p>
         </w:tc>
@@ -856,7 +1017,7 @@
                 <w:rFonts w:ascii="Calibri" w:hAnsi="Calibri"/>
                 <w:sz w:val="20"/>
               </w:rPr>
-              <w:t xml:space="preserve">Full text under a hand-drawn squiggle, with HAPPENS ON, PINNED BY and POSTED rows, plus a Share / Save bar.</w:t>
+              <w:t xml:space="preserve">Full text under a hand-drawn squiggle, with VENUE, HAPPENS ON, PINNED BY and POSTED rows, plus a Share / Save bar.</w:t>
             </w:r>
           </w:p>
         </w:tc>
@@ -936,7 +1097,7 @@
                 <w:rFonts w:ascii="Calibri" w:hAnsi="Calibri"/>
                 <w:sz w:val="20"/>
               </w:rPr>
-              <w:t xml:space="preserve">?screen=detail and ?screen=compose open a screen directly.</w:t>
+              <w:t xml:space="preserve">?screen=board, ?screen=events, ?screen=detail and ?screen=compose open a screen directly.</w:t>
             </w:r>
           </w:p>
         </w:tc>
@@ -1470,7 +1631,7 @@
                 <w:rFonts w:ascii="Calibri" w:hAnsi="Calibri"/>
                 <w:sz w:val="20"/>
               </w:rPr>
-              <w:t xml:space="preserve">lib/main.dart - a single file holding the model, painters and the three screens</w:t>
+              <w:t xml:space="preserve">lib/main.dart - a single file of about 3,200 lines holding the model, painters and the four screens (board, events, detail, compose)</w:t>
             </w:r>
           </w:p>
         </w:tc>
@@ -1604,7 +1765,7 @@
                 <w:rFonts w:ascii="Calibri" w:hAnsi="Calibri"/>
                 <w:sz w:val="20"/>
               </w:rPr>
-              <w:t xml:space="preserve">The whole application: data model, painters, board, detail sheet, form, persistence</w:t>
+              <w:t xml:space="preserve">The whole application: data model, painters, board, events page, detail sheet, form, persistence (about 3,200 lines)</w:t>
             </w:r>
           </w:p>
         </w:tc>
@@ -1644,7 +1805,7 @@
                 <w:rFonts w:ascii="Calibri" w:hAnsi="Calibri"/>
                 <w:sz w:val="20"/>
               </w:rPr>
-              <w:t xml:space="preserve">8 widget tests covering board, filters, search, CRUD and saving</w:t>
+              <w:t xml:space="preserve">12 widget tests covering the board, the events page, filters, search, CRUD, saving and expiry</w:t>
             </w:r>
           </w:p>
         </w:tc>
@@ -1684,7 +1845,7 @@
                 <w:rFonts w:ascii="Calibri" w:hAnsi="Calibri"/>
                 <w:sz w:val="20"/>
               </w:rPr>
-              <w:t xml:space="preserve">3 golden (visual regression) snapshot tests</w:t>
+              <w:t xml:space="preserve">4 golden (visual regression) snapshot tests: board, detail, compose, events</w:t>
             </w:r>
           </w:p>
         </w:tc>
@@ -2527,6 +2688,124 @@
                 <w:sz w:val="20"/>
               </w:rPr>
               <w:t xml:space="preserve">Date and time when the announcement happens</w:t>
+            </w:r>
+          </w:p>
+        </w:tc>
+      </w:tr>
+      <w:tr>
+        <w:tc>
+          <w:tcPr>
+            <w:tcW w:w="3120" w:type="dxa"/>
+            <w:vAlign w:val="top"/>
+          </w:tcPr>
+          <w:p>
+            <w:pPr>
+              <w:spacing w:before="40" w:after="40"/>
+              <w:jc w:val="left"/>
+            </w:pPr>
+            <w:r>
+              <w:rPr>
+                <w:rFonts w:ascii="Calibri" w:hAnsi="Calibri"/>
+                <w:sz w:val="20"/>
+              </w:rPr>
+              <w:t xml:space="preserve">venue</w:t>
+            </w:r>
+          </w:p>
+        </w:tc>
+        <w:tc>
+          <w:tcPr>
+            <w:tcW w:w="3120" w:type="dxa"/>
+            <w:vAlign w:val="top"/>
+          </w:tcPr>
+          <w:p>
+            <w:pPr>
+              <w:spacing w:before="40" w:after="40"/>
+              <w:jc w:val="left"/>
+            </w:pPr>
+            <w:r>
+              <w:rPr>
+                <w:rFonts w:ascii="Calibri" w:hAnsi="Calibri"/>
+                <w:sz w:val="20"/>
+              </w:rPr>
+              <w:t xml:space="preserve">String (optional)</w:t>
+            </w:r>
+          </w:p>
+        </w:tc>
+        <w:tc>
+          <w:tcPr>
+            <w:tcW w:w="3120" w:type="dxa"/>
+            <w:vAlign w:val="top"/>
+          </w:tcPr>
+          <w:p>
+            <w:pPr>
+              <w:spacing w:before="40" w:after="40"/>
+              <w:jc w:val="left"/>
+            </w:pPr>
+            <w:r>
+              <w:rPr>
+                <w:rFonts w:ascii="Calibri" w:hAnsi="Calibri"/>
+                <w:sz w:val="20"/>
+              </w:rPr>
+              <w:t xml:space="preserve">Where it happens - "CHCC Gymnasium", "Room 204"...</w:t>
+            </w:r>
+          </w:p>
+        </w:tc>
+      </w:tr>
+      <w:tr>
+        <w:tc>
+          <w:tcPr>
+            <w:tcW w:w="3120" w:type="dxa"/>
+            <w:vAlign w:val="top"/>
+          </w:tcPr>
+          <w:p>
+            <w:pPr>
+              <w:spacing w:before="40" w:after="40"/>
+              <w:jc w:val="left"/>
+            </w:pPr>
+            <w:r>
+              <w:rPr>
+                <w:rFonts w:ascii="Calibri" w:hAnsi="Calibri"/>
+                <w:sz w:val="20"/>
+              </w:rPr>
+              <w:t xml:space="preserve">expiresAt</w:t>
+            </w:r>
+          </w:p>
+        </w:tc>
+        <w:tc>
+          <w:tcPr>
+            <w:tcW w:w="3120" w:type="dxa"/>
+            <w:vAlign w:val="top"/>
+          </w:tcPr>
+          <w:p>
+            <w:pPr>
+              <w:spacing w:before="40" w:after="40"/>
+              <w:jc w:val="left"/>
+            </w:pPr>
+            <w:r>
+              <w:rPr>
+                <w:rFonts w:ascii="Calibri" w:hAnsi="Calibri"/>
+                <w:sz w:val="20"/>
+              </w:rPr>
+              <w:t xml:space="preserve">DateTime (optional)</w:t>
+            </w:r>
+          </w:p>
+        </w:tc>
+        <w:tc>
+          <w:tcPr>
+            <w:tcW w:w="3120" w:type="dxa"/>
+            <w:vAlign w:val="top"/>
+          </w:tcPr>
+          <w:p>
+            <w:pPr>
+              <w:spacing w:before="40" w:after="40"/>
+              <w:jc w:val="left"/>
+            </w:pPr>
+            <w:r>
+              <w:rPr>
+                <w:rFonts w:ascii="Calibri" w:hAnsi="Calibri"/>
+                <w:sz w:val="20"/>
+              </w:rPr>
+              <w:t xml:space="preserve">Take-it-down time of a temporary note; expired notes are dropped</w:t>
             </w:r>
           </w:p>
         </w:tc>
@@ -2693,7 +2972,7 @@
           <w:rFonts w:ascii="Calibri" w:hAnsi="Calibri"/>
           <w:sz w:val="22"/>
         </w:rPr>
-        <w:t xml:space="preserve">Figure 2 shows a single note: when it happens, who pinned it, when it was posted, and the Share / Save bar.</w:t>
+        <w:t xml:space="preserve">Figure 2 shows a single note: where it happens, when it happens, who pinned it, when it was posted, and the Share / Save bar.</w:t>
       </w:r>
     </w:p>
     <w:p>
@@ -2751,7 +3030,7 @@
           <w:i/>
           <w:sz w:val="18"/>
         </w:rPr>
-        <w:t xml:space="preserve">Figure 2. The note detail sheet with HAPPENS ON, PINNED BY and POSTED.</w:t>
+        <w:t xml:space="preserve">Figure 2. The note detail sheet with VENUE, HAPPENS ON, PINNED BY and POSTED.</w:t>
       </w:r>
     </w:p>
     <w:p>
@@ -2822,7 +3101,78 @@
           <w:i/>
           <w:sz w:val="18"/>
         </w:rPr>
-        <w:t xml:space="preserve">Figure 3. Pin a new note - title, category, description, poster, date, time and the urgent switch.</w:t>
+        <w:t xml:space="preserve">Figure 3. Pin a new note - title, category, description, poster, date, time, venue, take-it-down timer and the urgent switch.</w:t>
+      </w:r>
+    </w:p>
+    <w:p>
+      <w:pPr>
+        <w:spacing w:before="0" w:after="160"/>
+        <w:jc w:val="both"/>
+      </w:pPr>
+      <w:r>
+        <w:rPr>
+          <w:rFonts w:ascii="Calibri" w:hAnsi="Calibri"/>
+          <w:sz w:val="22"/>
+        </w:rPr>
+        <w:t xml:space="preserve">Figure 4 shows the Events page: the second tab of the bottom navigation, listing dated notes soonest-first with their venues and countdowns.</w:t>
+      </w:r>
+    </w:p>
+    <w:p>
+      <w:pPr>
+        <w:keepNext/>
+        <w:spacing w:before="120" w:after="40"/>
+        <w:jc w:val="center"/>
+      </w:pPr>
+      <w:r>
+        <w:drawing>
+          <wp:inline distT="0" distB="0" distL="0" distR="0">
+            <wp:extent cx="5395000" cy="4114831"/>
+            <wp:effectExtent l="0" t="0" r="0" b="0"/>
+            <wp:docPr id="4" name="Figure 4"/>
+            <wp:cNvGraphicFramePr>
+              <a:graphicFrameLocks xmlns:a="http://schemas.openxmlformats.org/drawingml/2006/main" noChangeAspect="1"/>
+            </wp:cNvGraphicFramePr>
+            <a:graphic xmlns:a="http://schemas.openxmlformats.org/drawingml/2006/main">
+              <a:graphicData uri="http://schemas.openxmlformats.org/drawingml/2006/picture">
+                <pic:pic xmlns:pic="http://schemas.openxmlformats.org/drawingml/2006/picture">
+                  <pic:nvPicPr>
+                    <pic:cNvPr id="4" name="fig4.png"/>
+                    <pic:cNvPicPr/>
+                  </pic:nvPicPr>
+                  <pic:blipFill>
+                    <a:blip r:embed="rIdImg4"/>
+                    <a:stretch>
+                      <a:fillRect/>
+                    </a:stretch>
+                  </pic:blipFill>
+                  <pic:spPr>
+                    <a:xfrm>
+                      <a:off x="0" y="0"/>
+                      <a:ext cx="5395000" cy="4114831"/>
+                    </a:xfrm>
+                    <a:prstGeom prst="rect">
+                      <a:avLst/>
+                    </a:prstGeom>
+                  </pic:spPr>
+                </pic:pic>
+              </a:graphicData>
+            </a:graphic>
+          </wp:inline>
+        </w:drawing>
+      </w:r>
+    </w:p>
+    <w:p>
+      <w:pPr>
+        <w:spacing w:before="0" w:after="280"/>
+        <w:jc w:val="center"/>
+      </w:pPr>
+      <w:r>
+        <w:rPr>
+          <w:rFonts w:ascii="Calibri" w:hAnsi="Calibri"/>
+          <w:i/>
+          <w:sz w:val="18"/>
+        </w:rPr>
+        <w:t xml:space="preserve">Figure 4. The events page - counters, the Upcoming / Past switch, and dated notes with venue and countdown.</w:t>
       </w:r>
     </w:p>
     <w:p>
@@ -2993,7 +3343,7 @@
                 <w:rFonts w:ascii="Calibri" w:hAnsi="Calibri"/>
                 <w:sz w:val="20"/>
               </w:rPr>
-              <w:t xml:space="preserve">Board renders notes and filter tabs</w:t>
+              <w:t xml:space="preserve">board renders notes and filter tabs</w:t>
             </w:r>
           </w:p>
         </w:tc>
@@ -3071,7 +3421,7 @@
                 <w:rFonts w:ascii="Calibri" w:hAnsi="Calibri"/>
                 <w:sz w:val="20"/>
               </w:rPr>
-              <w:t xml:space="preserve">Filtering by category narrows the board</w:t>
+              <w:t xml:space="preserve">filtering by category narrows the board</w:t>
             </w:r>
           </w:p>
         </w:tc>
@@ -3149,7 +3499,7 @@
                 <w:rFonts w:ascii="Calibri" w:hAnsi="Calibri"/>
                 <w:sz w:val="20"/>
               </w:rPr>
-              <w:t xml:space="preserve">Search finds notes by keyword</w:t>
+              <w:t xml:space="preserve">search finds notes by keyword</w:t>
             </w:r>
           </w:p>
         </w:tc>
@@ -3227,7 +3577,7 @@
                 <w:rFonts w:ascii="Calibri" w:hAnsi="Calibri"/>
                 <w:sz w:val="20"/>
               </w:rPr>
-              <w:t xml:space="preserve">Compose screen opens from a filtered board</w:t>
+              <w:t xml:space="preserve">compose screen opens from a filtered board</w:t>
             </w:r>
           </w:p>
         </w:tc>
@@ -3305,7 +3655,7 @@
                 <w:rFonts w:ascii="Calibri" w:hAnsi="Calibri"/>
                 <w:sz w:val="20"/>
               </w:rPr>
-              <w:t xml:space="preserve">Tapping a note opens its sheet</w:t>
+              <w:t xml:space="preserve">tapping a note opens its sheet</w:t>
             </w:r>
           </w:p>
         </w:tc>
@@ -3383,7 +3733,7 @@
                 <w:rFonts w:ascii="Calibri" w:hAnsi="Calibri"/>
                 <w:sz w:val="20"/>
               </w:rPr>
-              <w:t xml:space="preserve">Deleting from the sheet unpins it and UNDO brings it back</w:t>
+              <w:t xml:space="preserve">deleting from the sheet unpins it and UNDO brings it back</w:t>
             </w:r>
           </w:p>
         </w:tc>
@@ -3461,7 +3811,7 @@
                 <w:rFonts w:ascii="Calibri" w:hAnsi="Calibri"/>
                 <w:sz w:val="20"/>
               </w:rPr>
-              <w:t xml:space="preserve">Saving a note marks it and the saved filter shows it</w:t>
+              <w:t xml:space="preserve">saving a note marks it and the saved filter shows it</w:t>
             </w:r>
           </w:p>
         </w:tc>
@@ -3539,7 +3889,7 @@
                 <w:rFonts w:ascii="Calibri" w:hAnsi="Calibri"/>
                 <w:sz w:val="20"/>
               </w:rPr>
-              <w:t xml:space="preserve">Editing a note keeps the change</w:t>
+              <w:t xml:space="preserve">editing a note keeps the change</w:t>
             </w:r>
           </w:p>
         </w:tc>
@@ -3617,7 +3967,319 @@
                 <w:rFonts w:ascii="Calibri" w:hAnsi="Calibri"/>
                 <w:sz w:val="20"/>
               </w:rPr>
-              <w:t xml:space="preserve">Golden snapshot - board</w:t>
+              <w:t xml:space="preserve">events tab lists upcoming notes with their venues</w:t>
+            </w:r>
+          </w:p>
+        </w:tc>
+        <w:tc>
+          <w:tcPr>
+            <w:tcW w:w="2340" w:type="dxa"/>
+            <w:vAlign w:val="top"/>
+          </w:tcPr>
+          <w:p>
+            <w:pPr>
+              <w:spacing w:before="40" w:after="40"/>
+              <w:jc w:val="left"/>
+            </w:pPr>
+            <w:r>
+              <w:rPr>
+                <w:rFonts w:ascii="Calibri" w:hAnsi="Calibri"/>
+                <w:sz w:val="20"/>
+              </w:rPr>
+              <w:t xml:space="preserve">Widget</w:t>
+            </w:r>
+          </w:p>
+        </w:tc>
+        <w:tc>
+          <w:tcPr>
+            <w:tcW w:w="2340" w:type="dxa"/>
+            <w:vAlign w:val="top"/>
+          </w:tcPr>
+          <w:p>
+            <w:pPr>
+              <w:spacing w:before="40" w:after="40"/>
+              <w:jc w:val="left"/>
+            </w:pPr>
+            <w:r>
+              <w:rPr>
+                <w:rFonts w:ascii="Calibri" w:hAnsi="Calibri"/>
+                <w:sz w:val="20"/>
+              </w:rPr>
+              <w:t xml:space="preserve">Passed</w:t>
+            </w:r>
+          </w:p>
+        </w:tc>
+      </w:tr>
+      <w:tr>
+        <w:tc>
+          <w:tcPr>
+            <w:tcW w:w="2340" w:type="dxa"/>
+            <w:vAlign w:val="top"/>
+          </w:tcPr>
+          <w:p>
+            <w:pPr>
+              <w:spacing w:before="40" w:after="40"/>
+              <w:jc w:val="left"/>
+            </w:pPr>
+            <w:r>
+              <w:rPr>
+                <w:rFonts w:ascii="Calibri" w:hAnsi="Calibri"/>
+                <w:sz w:val="20"/>
+              </w:rPr>
+              <w:t xml:space="preserve">10</w:t>
+            </w:r>
+          </w:p>
+        </w:tc>
+        <w:tc>
+          <w:tcPr>
+            <w:tcW w:w="2340" w:type="dxa"/>
+            <w:vAlign w:val="top"/>
+          </w:tcPr>
+          <w:p>
+            <w:pPr>
+              <w:spacing w:before="40" w:after="40"/>
+              <w:jc w:val="left"/>
+            </w:pPr>
+            <w:r>
+              <w:rPr>
+                <w:rFonts w:ascii="Calibri" w:hAnsi="Calibri"/>
+                <w:sz w:val="20"/>
+              </w:rPr>
+              <w:t xml:space="preserve">events run soonest first, past ones latest first</w:t>
+            </w:r>
+          </w:p>
+        </w:tc>
+        <w:tc>
+          <w:tcPr>
+            <w:tcW w:w="2340" w:type="dxa"/>
+            <w:vAlign w:val="top"/>
+          </w:tcPr>
+          <w:p>
+            <w:pPr>
+              <w:spacing w:before="40" w:after="40"/>
+              <w:jc w:val="left"/>
+            </w:pPr>
+            <w:r>
+              <w:rPr>
+                <w:rFonts w:ascii="Calibri" w:hAnsi="Calibri"/>
+                <w:sz w:val="20"/>
+              </w:rPr>
+              <w:t xml:space="preserve">Widget</w:t>
+            </w:r>
+          </w:p>
+        </w:tc>
+        <w:tc>
+          <w:tcPr>
+            <w:tcW w:w="2340" w:type="dxa"/>
+            <w:vAlign w:val="top"/>
+          </w:tcPr>
+          <w:p>
+            <w:pPr>
+              <w:spacing w:before="40" w:after="40"/>
+              <w:jc w:val="left"/>
+            </w:pPr>
+            <w:r>
+              <w:rPr>
+                <w:rFonts w:ascii="Calibri" w:hAnsi="Calibri"/>
+                <w:sz w:val="20"/>
+              </w:rPr>
+              <w:t xml:space="preserve">Passed</w:t>
+            </w:r>
+          </w:p>
+        </w:tc>
+      </w:tr>
+      <w:tr>
+        <w:tc>
+          <w:tcPr>
+            <w:tcW w:w="2340" w:type="dxa"/>
+            <w:vAlign w:val="top"/>
+          </w:tcPr>
+          <w:p>
+            <w:pPr>
+              <w:spacing w:before="40" w:after="40"/>
+              <w:jc w:val="left"/>
+            </w:pPr>
+            <w:r>
+              <w:rPr>
+                <w:rFonts w:ascii="Calibri" w:hAnsi="Calibri"/>
+                <w:sz w:val="20"/>
+              </w:rPr>
+              <w:t xml:space="preserve">11</w:t>
+            </w:r>
+          </w:p>
+        </w:tc>
+        <w:tc>
+          <w:tcPr>
+            <w:tcW w:w="2340" w:type="dxa"/>
+            <w:vAlign w:val="top"/>
+          </w:tcPr>
+          <w:p>
+            <w:pPr>
+              <w:spacing w:before="40" w:after="40"/>
+              <w:jc w:val="left"/>
+            </w:pPr>
+            <w:r>
+              <w:rPr>
+                <w:rFonts w:ascii="Calibri" w:hAnsi="Calibri"/>
+                <w:sz w:val="20"/>
+              </w:rPr>
+              <w:t xml:space="preserve">a temporary note takes itself down when its time is up</w:t>
+            </w:r>
+          </w:p>
+        </w:tc>
+        <w:tc>
+          <w:tcPr>
+            <w:tcW w:w="2340" w:type="dxa"/>
+            <w:vAlign w:val="top"/>
+          </w:tcPr>
+          <w:p>
+            <w:pPr>
+              <w:spacing w:before="40" w:after="40"/>
+              <w:jc w:val="left"/>
+            </w:pPr>
+            <w:r>
+              <w:rPr>
+                <w:rFonts w:ascii="Calibri" w:hAnsi="Calibri"/>
+                <w:sz w:val="20"/>
+              </w:rPr>
+              <w:t xml:space="preserve">Widget</w:t>
+            </w:r>
+          </w:p>
+        </w:tc>
+        <w:tc>
+          <w:tcPr>
+            <w:tcW w:w="2340" w:type="dxa"/>
+            <w:vAlign w:val="top"/>
+          </w:tcPr>
+          <w:p>
+            <w:pPr>
+              <w:spacing w:before="40" w:after="40"/>
+              <w:jc w:val="left"/>
+            </w:pPr>
+            <w:r>
+              <w:rPr>
+                <w:rFonts w:ascii="Calibri" w:hAnsi="Calibri"/>
+                <w:sz w:val="20"/>
+              </w:rPr>
+              <w:t xml:space="preserve">Passed</w:t>
+            </w:r>
+          </w:p>
+        </w:tc>
+      </w:tr>
+      <w:tr>
+        <w:tc>
+          <w:tcPr>
+            <w:tcW w:w="2340" w:type="dxa"/>
+            <w:vAlign w:val="top"/>
+          </w:tcPr>
+          <w:p>
+            <w:pPr>
+              <w:spacing w:before="40" w:after="40"/>
+              <w:jc w:val="left"/>
+            </w:pPr>
+            <w:r>
+              <w:rPr>
+                <w:rFonts w:ascii="Calibri" w:hAnsi="Calibri"/>
+                <w:sz w:val="20"/>
+              </w:rPr>
+              <w:t xml:space="preserve">12</w:t>
+            </w:r>
+          </w:p>
+        </w:tc>
+        <w:tc>
+          <w:tcPr>
+            <w:tcW w:w="2340" w:type="dxa"/>
+            <w:vAlign w:val="top"/>
+          </w:tcPr>
+          <w:p>
+            <w:pPr>
+              <w:spacing w:before="40" w:after="40"/>
+              <w:jc w:val="left"/>
+            </w:pPr>
+            <w:r>
+              <w:rPr>
+                <w:rFonts w:ascii="Calibri" w:hAnsi="Calibri"/>
+                <w:sz w:val="20"/>
+              </w:rPr>
+              <w:t xml:space="preserve">pinning a temporary note with a venue</w:t>
+            </w:r>
+          </w:p>
+        </w:tc>
+        <w:tc>
+          <w:tcPr>
+            <w:tcW w:w="2340" w:type="dxa"/>
+            <w:vAlign w:val="top"/>
+          </w:tcPr>
+          <w:p>
+            <w:pPr>
+              <w:spacing w:before="40" w:after="40"/>
+              <w:jc w:val="left"/>
+            </w:pPr>
+            <w:r>
+              <w:rPr>
+                <w:rFonts w:ascii="Calibri" w:hAnsi="Calibri"/>
+                <w:sz w:val="20"/>
+              </w:rPr>
+              <w:t xml:space="preserve">Widget</w:t>
+            </w:r>
+          </w:p>
+        </w:tc>
+        <w:tc>
+          <w:tcPr>
+            <w:tcW w:w="2340" w:type="dxa"/>
+            <w:vAlign w:val="top"/>
+          </w:tcPr>
+          <w:p>
+            <w:pPr>
+              <w:spacing w:before="40" w:after="40"/>
+              <w:jc w:val="left"/>
+            </w:pPr>
+            <w:r>
+              <w:rPr>
+                <w:rFonts w:ascii="Calibri" w:hAnsi="Calibri"/>
+                <w:sz w:val="20"/>
+              </w:rPr>
+              <w:t xml:space="preserve">Passed</w:t>
+            </w:r>
+          </w:p>
+        </w:tc>
+      </w:tr>
+      <w:tr>
+        <w:tc>
+          <w:tcPr>
+            <w:tcW w:w="2340" w:type="dxa"/>
+            <w:vAlign w:val="top"/>
+          </w:tcPr>
+          <w:p>
+            <w:pPr>
+              <w:spacing w:before="40" w:after="40"/>
+              <w:jc w:val="left"/>
+            </w:pPr>
+            <w:r>
+              <w:rPr>
+                <w:rFonts w:ascii="Calibri" w:hAnsi="Calibri"/>
+                <w:sz w:val="20"/>
+              </w:rPr>
+              <w:t xml:space="preserve">13</w:t>
+            </w:r>
+          </w:p>
+        </w:tc>
+        <w:tc>
+          <w:tcPr>
+            <w:tcW w:w="2340" w:type="dxa"/>
+            <w:vAlign w:val="top"/>
+          </w:tcPr>
+          <w:p>
+            <w:pPr>
+              <w:spacing w:before="40" w:after="40"/>
+              <w:jc w:val="left"/>
+            </w:pPr>
+            <w:r>
+              <w:rPr>
+                <w:rFonts w:ascii="Calibri" w:hAnsi="Calibri"/>
+                <w:sz w:val="20"/>
+              </w:rPr>
+              <w:t xml:space="preserve">golden snapshot - board</w:t>
             </w:r>
           </w:p>
         </w:tc>
@@ -3676,26 +4338,26 @@
                 <w:rFonts w:ascii="Calibri" w:hAnsi="Calibri"/>
                 <w:sz w:val="20"/>
               </w:rPr>
-              <w:t xml:space="preserve">10</w:t>
-            </w:r>
-          </w:p>
-        </w:tc>
-        <w:tc>
-          <w:tcPr>
-            <w:tcW w:w="2340" w:type="dxa"/>
-            <w:vAlign w:val="top"/>
-          </w:tcPr>
-          <w:p>
-            <w:pPr>
-              <w:spacing w:before="40" w:after="40"/>
-              <w:jc w:val="left"/>
-            </w:pPr>
-            <w:r>
-              <w:rPr>
-                <w:rFonts w:ascii="Calibri" w:hAnsi="Calibri"/>
-                <w:sz w:val="20"/>
-              </w:rPr>
-              <w:t xml:space="preserve">Golden snapshot - detail sheet</w:t>
+              <w:t xml:space="preserve">14</w:t>
+            </w:r>
+          </w:p>
+        </w:tc>
+        <w:tc>
+          <w:tcPr>
+            <w:tcW w:w="2340" w:type="dxa"/>
+            <w:vAlign w:val="top"/>
+          </w:tcPr>
+          <w:p>
+            <w:pPr>
+              <w:spacing w:before="40" w:after="40"/>
+              <w:jc w:val="left"/>
+            </w:pPr>
+            <w:r>
+              <w:rPr>
+                <w:rFonts w:ascii="Calibri" w:hAnsi="Calibri"/>
+                <w:sz w:val="20"/>
+              </w:rPr>
+              <w:t xml:space="preserve">golden snapshot - detail sheet</w:t>
             </w:r>
           </w:p>
         </w:tc>
@@ -3754,26 +4416,104 @@
                 <w:rFonts w:ascii="Calibri" w:hAnsi="Calibri"/>
                 <w:sz w:val="20"/>
               </w:rPr>
-              <w:t xml:space="preserve">11</w:t>
-            </w:r>
-          </w:p>
-        </w:tc>
-        <w:tc>
-          <w:tcPr>
-            <w:tcW w:w="2340" w:type="dxa"/>
-            <w:vAlign w:val="top"/>
-          </w:tcPr>
-          <w:p>
-            <w:pPr>
-              <w:spacing w:before="40" w:after="40"/>
-              <w:jc w:val="left"/>
-            </w:pPr>
-            <w:r>
-              <w:rPr>
-                <w:rFonts w:ascii="Calibri" w:hAnsi="Calibri"/>
-                <w:sz w:val="20"/>
-              </w:rPr>
-              <w:t xml:space="preserve">Golden snapshot - compose form</w:t>
+              <w:t xml:space="preserve">15</w:t>
+            </w:r>
+          </w:p>
+        </w:tc>
+        <w:tc>
+          <w:tcPr>
+            <w:tcW w:w="2340" w:type="dxa"/>
+            <w:vAlign w:val="top"/>
+          </w:tcPr>
+          <w:p>
+            <w:pPr>
+              <w:spacing w:before="40" w:after="40"/>
+              <w:jc w:val="left"/>
+            </w:pPr>
+            <w:r>
+              <w:rPr>
+                <w:rFonts w:ascii="Calibri" w:hAnsi="Calibri"/>
+                <w:sz w:val="20"/>
+              </w:rPr>
+              <w:t xml:space="preserve">golden snapshot - compose form</w:t>
+            </w:r>
+          </w:p>
+        </w:tc>
+        <w:tc>
+          <w:tcPr>
+            <w:tcW w:w="2340" w:type="dxa"/>
+            <w:vAlign w:val="top"/>
+          </w:tcPr>
+          <w:p>
+            <w:pPr>
+              <w:spacing w:before="40" w:after="40"/>
+              <w:jc w:val="left"/>
+            </w:pPr>
+            <w:r>
+              <w:rPr>
+                <w:rFonts w:ascii="Calibri" w:hAnsi="Calibri"/>
+                <w:sz w:val="20"/>
+              </w:rPr>
+              <w:t xml:space="preserve">Visual</w:t>
+            </w:r>
+          </w:p>
+        </w:tc>
+        <w:tc>
+          <w:tcPr>
+            <w:tcW w:w="2340" w:type="dxa"/>
+            <w:vAlign w:val="top"/>
+          </w:tcPr>
+          <w:p>
+            <w:pPr>
+              <w:spacing w:before="40" w:after="40"/>
+              <w:jc w:val="left"/>
+            </w:pPr>
+            <w:r>
+              <w:rPr>
+                <w:rFonts w:ascii="Calibri" w:hAnsi="Calibri"/>
+                <w:sz w:val="20"/>
+              </w:rPr>
+              <w:t xml:space="preserve">Passed</w:t>
+            </w:r>
+          </w:p>
+        </w:tc>
+      </w:tr>
+      <w:tr>
+        <w:tc>
+          <w:tcPr>
+            <w:tcW w:w="2340" w:type="dxa"/>
+            <w:vAlign w:val="top"/>
+          </w:tcPr>
+          <w:p>
+            <w:pPr>
+              <w:spacing w:before="40" w:after="40"/>
+              <w:jc w:val="left"/>
+            </w:pPr>
+            <w:r>
+              <w:rPr>
+                <w:rFonts w:ascii="Calibri" w:hAnsi="Calibri"/>
+                <w:sz w:val="20"/>
+              </w:rPr>
+              <w:t xml:space="preserve">16</w:t>
+            </w:r>
+          </w:p>
+        </w:tc>
+        <w:tc>
+          <w:tcPr>
+            <w:tcW w:w="2340" w:type="dxa"/>
+            <w:vAlign w:val="top"/>
+          </w:tcPr>
+          <w:p>
+            <w:pPr>
+              <w:spacing w:before="40" w:after="40"/>
+              <w:jc w:val="left"/>
+            </w:pPr>
+            <w:r>
+              <w:rPr>
+                <w:rFonts w:ascii="Calibri" w:hAnsi="Calibri"/>
+                <w:sz w:val="20"/>
+              </w:rPr>
+              <w:t xml:space="preserve">golden snapshot - events page</w:t>
             </w:r>
           </w:p>
         </w:tc>
@@ -3848,7 +4588,7 @@
           <w:rFonts w:ascii="Calibri" w:hAnsi="Calibri"/>
           <w:sz w:val="22"/>
         </w:rPr>
-        <w:t xml:space="preserve">flutter test - 11 of 11 tests passed.</w:t>
+        <w:t xml:space="preserve">flutter test - 16 of 16 tests passed (12 widget tests and 4 golden snapshots).</w:t>
       </w:r>
     </w:p>
     <w:p>
@@ -4119,7 +4859,21 @@
           <w:rFonts w:ascii="Consolas" w:hAnsi="Consolas"/>
           <w:sz w:val="20"/>
         </w:rPr>
-        <w:t xml:space="preserve">http://127.0.0.1:8080/?screen=detail     # deep link to a screen</w:t>
+        <w:t xml:space="preserve">http://127.0.0.1:8080/?screen=events    # deep link to the events page</w:t>
+      </w:r>
+    </w:p>
+    <w:p>
+      <w:pPr>
+        <w:spacing w:before="0" w:after="40"/>
+        <w:ind w:left="360" w:hanging="0"/>
+        <w:jc w:val="left"/>
+      </w:pPr>
+      <w:r>
+        <w:rPr>
+          <w:rFonts w:ascii="Consolas" w:hAnsi="Consolas"/>
+          <w:sz w:val="20"/>
+        </w:rPr>
+        <w:t xml:space="preserve">http://127.0.0.1:8080/?screen=detail     # deep link to a note</w:t>
       </w:r>
     </w:p>
     <w:p>
@@ -4458,7 +5212,7 @@
                 <w:rFonts w:ascii="Calibri" w:hAnsi="Calibri"/>
                 <w:sz w:val="20"/>
               </w:rPr>
-              <w:t xml:space="preserve">docs/screenshots/fig1_board.png, fig2_detail.png, fig3_compose.png</w:t>
+              <w:t xml:space="preserve">docs/screenshots/fig1_board.png, fig2_detail.png, fig3_compose.png, fig4_events.png</w:t>
             </w:r>
           </w:p>
         </w:tc>
@@ -4552,7 +5306,7 @@
           <w:rFonts w:ascii="Calibri" w:hAnsi="Calibri"/>
           <w:sz w:val="22"/>
         </w:rPr>
-        <w:t xml:space="preserve">5. Possible next features: real system sharing, a calendar view of event dates, a faculty-only posting mode, and rich text for the note body.</w:t>
+        <w:t xml:space="preserve">5. Possible next features: real system sharing, recurring notices, section or subject subscriptions, a printable timetable export, and rich text for the note body.</w:t>
       </w:r>
     </w:p>
     <w:p>
@@ -4580,7 +5334,7 @@
           <w:rFonts w:ascii="Calibri" w:hAnsi="Calibri"/>
           <w:sz w:val="22"/>
         </w:rPr>
-        <w:t xml:space="preserve">CHCC Student Announcements meets its objectives: it gathers every school notice on one board, tells the student both when the notice was made and when it happens, and lets the student filter, search, bookmark, add, edit and delete notes safely. The board is kept locally so it is still there the next time the app opens, and it ships as an installable Android APK and as a web link. The test suite (11 of 11) and static analysis confirm that the delivered build is stable.</w:t>
+        <w:t xml:space="preserve">CHCC Student Announcements meets its objectives: it gathers every school notice on one board, tells the student both when the notice was made and when it happens, and lets the student filter, search, bookmark, add, edit and delete notes safely. The Events page turns the same data into a dated diary ordered soonest-first, and the venue and take-it-down fields keep the board tidy without anyone having to clear it by hand. The board is kept locally so it is still there the next time the app opens, and it ships as an installable Android APK and as a web link. The test suite (16 of 16) and static analysis confirm that the delivered build is stable.</w:t>
       </w:r>
     </w:p>
     <w:sectPr>

</xml_diff>